<commit_message>
Clarify and reorganize project documentation
Add developer setup, database creation, ownership and maintenance guides; move superseded material into documentation history; and revise platform, recovery and browser-client guidance. Document schema-only creation and monitoring-isolation requirements alongside the open implementation backlog. No application behavior changed.
</commit_message>
<xml_diff>
--- a/docs/user-guides/linux/01-PrepareOrchidAppForFirstUseLinuxPi.docx
+++ b/docs/user-guides/linux/01-PrepareOrchidAppForFirstUseLinuxPi.docx
@@ -9,7 +9,7 @@
       <w:r>
         <w:rPr>
           <w:b/>
-          <w:color w:val="1F4E79"/>
+          <w:color w:val="000000"/>
           <w:sz w:val="36"/>
         </w:rPr>
         <w:t>OrchidApp</w:t>
@@ -22,7 +22,7 @@
       <w:r>
         <w:rPr>
           <w:b/>
-          <w:color w:val="1F4E79"/>
+          <w:color w:val="000000"/>
           <w:sz w:val="48"/>
         </w:rPr>
         <w:t>Prepare OrchidApp for First Use</w:t>
@@ -34,6 +34,9 @@
         <w:jc w:val="center"/>
       </w:pPr>
       <w:r>
+        <w:rPr>
+          <w:color w:val="000000"/>
+        </w:rPr>
         <w:t>First-run setup checklist for Raspberry Pi / Linux</w:t>
       </w:r>
     </w:p>
@@ -42,6 +45,9 @@
         <w:jc w:val="center"/>
       </w:pPr>
       <w:r>
+        <w:rPr>
+          <w:color w:val="000000"/>
+        </w:rPr>
         <w:t>Applies to: Raspberry Pi / Linux</w:t>
       </w:r>
     </w:p>
@@ -51,7 +57,7 @@
       </w:pPr>
       <w:r>
         <w:rPr>
-          <w:color w:val="595959"/>
+          <w:color w:val="000000"/>
         </w:rPr>
         <w:t>User guide</w:t>
       </w:r>
@@ -72,6 +78,10 @@
         <w:pStyle w:val="Heading2"/>
       </w:pPr>
       <w:r>
+        <w:rPr>
+          <w:color w:val="000000"/>
+          <w:u w:val="none"/>
+        </w:rPr>
         <w:t>Before you start</w:t>
       </w:r>
     </w:p>
@@ -90,6 +100,10 @@
         <w:pStyle w:val="Heading2"/>
       </w:pPr>
       <w:r>
+        <w:rPr>
+          <w:color w:val="000000"/>
+          <w:u w:val="none"/>
+        </w:rPr>
         <w:t>Quick checklist</w:t>
       </w:r>
     </w:p>
@@ -122,7 +136,7 @@
         <w:pStyle w:val="ListBullet"/>
       </w:pPr>
       <w:r>
-        <w:t>Add at least one species / hybrid under that genus.</w:t>
+        <w:t>Add a species / hybrid, or the genus’s default unidentified entry under that genus.</w:t>
       </w:r>
     </w:p>
     <w:p>
@@ -146,6 +160,10 @@
         <w:pStyle w:val="Heading1"/>
       </w:pPr>
       <w:r>
+        <w:rPr>
+          <w:color w:val="000000"/>
+          <w:u w:val="none"/>
+        </w:rPr>
         <w:t>Step-by-step setup</w:t>
       </w:r>
     </w:p>
@@ -154,6 +172,10 @@
         <w:pStyle w:val="Heading1"/>
       </w:pPr>
       <w:r>
+        <w:rPr>
+          <w:color w:val="000000"/>
+          <w:u w:val="none"/>
+        </w:rPr>
         <w:t>1. Start OrchidApp</w:t>
       </w:r>
     </w:p>
@@ -169,7 +191,7 @@
     </w:p>
     <w:p>
       <w:r>
-        <w:t>On first use, OrchidApp may need to prepare the local database and supporting files. This may take a few minutes.</w:t>
+        <w:t>The operator must complete schema-only database creation and installation checks before this guide. Opening the Linux site does not initialise its database.</w:t>
       </w:r>
     </w:p>
     <w:p>
@@ -182,6 +204,10 @@
         <w:pStyle w:val="Heading2"/>
       </w:pPr>
       <w:r>
+        <w:rPr>
+          <w:color w:val="000000"/>
+          <w:u w:val="none"/>
+        </w:rPr>
         <w:t>First-use performance note</w:t>
       </w:r>
     </w:p>
@@ -200,6 +226,10 @@
         <w:pStyle w:val="Heading1"/>
       </w:pPr>
       <w:r>
+        <w:rPr>
+          <w:color w:val="000000"/>
+          <w:u w:val="none"/>
+        </w:rPr>
         <w:t>2. Open Setup</w:t>
       </w:r>
     </w:p>
@@ -273,6 +303,10 @@
         <w:pStyle w:val="Heading1"/>
       </w:pPr>
       <w:r>
+        <w:rPr>
+          <w:color w:val="000000"/>
+          <w:u w:val="none"/>
+        </w:rPr>
         <w:t>3. Choose what to set up first</w:t>
       </w:r>
     </w:p>
@@ -378,6 +412,10 @@
         <w:pStyle w:val="Heading1"/>
       </w:pPr>
       <w:r>
+        <w:rPr>
+          <w:color w:val="000000"/>
+          <w:u w:val="none"/>
+        </w:rPr>
         <w:t>4. Add a plant group</w:t>
       </w:r>
     </w:p>
@@ -488,14 +526,26 @@
         <w:pStyle w:val="Heading1"/>
       </w:pPr>
       <w:r>
+        <w:rPr>
+          <w:color w:val="000000"/>
+          <w:u w:val="none"/>
+        </w:rPr>
         <w:t xml:space="preserve">5. Enter </w:t>
       </w:r>
       <w:proofErr w:type="gramStart"/>
       <w:r>
+        <w:rPr>
+          <w:color w:val="000000"/>
+          <w:u w:val="none"/>
+        </w:rPr>
         <w:t>the genus</w:t>
       </w:r>
       <w:proofErr w:type="gramEnd"/>
       <w:r>
+        <w:rPr>
+          <w:color w:val="000000"/>
+          <w:u w:val="none"/>
+        </w:rPr>
         <w:t xml:space="preserve"> details</w:t>
       </w:r>
     </w:p>
@@ -582,31 +632,28 @@
         <w:pStyle w:val="Heading1"/>
       </w:pPr>
       <w:r>
+        <w:rPr>
+          <w:color w:val="000000"/>
+          <w:u w:val="none"/>
+        </w:rPr>
         <w:t>6. Check the genus has been added</w:t>
       </w:r>
     </w:p>
     <w:p>
       <w:r>
-        <w:t xml:space="preserve">After saving, the </w:t>
+        <w:t>After saving, the genus Details page opens. Select Back to return to the list.</w:t>
       </w:r>
       <w:proofErr w:type="gramStart"/>
-      <w:r>
-        <w:t>genus</w:t>
-      </w:r>
+      <w:r/>
       <w:proofErr w:type="gramEnd"/>
-      <w:r>
-        <w:t xml:space="preserve"> is confirmed and select </w:t>
-      </w:r>
+      <w:r/>
       <w:r>
         <w:rPr>
           <w:b/>
           <w:bCs/>
         </w:rPr>
-        <w:t>Back</w:t>
       </w:r>
-      <w:r>
-        <w:t xml:space="preserve"> to return to the list.</w:t>
-      </w:r>
+      <w:r/>
     </w:p>
     <w:p>
       <w:pPr>
@@ -714,6 +761,10 @@
         <w:pStyle w:val="Heading1"/>
       </w:pPr>
       <w:r>
+        <w:rPr>
+          <w:color w:val="000000"/>
+          <w:u w:val="none"/>
+        </w:rPr>
         <w:t>7. Open Species / Hybrids</w:t>
       </w:r>
     </w:p>
@@ -791,6 +842,10 @@
         <w:pStyle w:val="Heading1"/>
       </w:pPr>
       <w:r>
+        <w:rPr>
+          <w:color w:val="000000"/>
+          <w:u w:val="none"/>
+        </w:rPr>
         <w:t>8. Add a species or hybrid</w:t>
       </w:r>
     </w:p>
@@ -874,6 +929,10 @@
         <w:pStyle w:val="Heading1"/>
       </w:pPr>
       <w:r>
+        <w:rPr>
+          <w:color w:val="000000"/>
+          <w:u w:val="none"/>
+        </w:rPr>
         <w:t>9. Save the species / hybrid</w:t>
       </w:r>
     </w:p>
@@ -955,6 +1014,10 @@
         <w:pStyle w:val="Heading1"/>
       </w:pPr>
       <w:r>
+        <w:rPr>
+          <w:color w:val="000000"/>
+          <w:u w:val="none"/>
+        </w:rPr>
         <w:t>10. Confirm the species / hybrid</w:t>
       </w:r>
     </w:p>
@@ -1019,6 +1082,10 @@
         <w:pStyle w:val="Heading1"/>
       </w:pPr>
       <w:r>
+        <w:rPr>
+          <w:color w:val="000000"/>
+          <w:u w:val="none"/>
+        </w:rPr>
         <w:t>What to do next</w:t>
       </w:r>
     </w:p>
@@ -1053,6 +1120,10 @@
         <w:pStyle w:val="Heading1"/>
       </w:pPr>
       <w:r>
+        <w:rPr>
+          <w:color w:val="000000"/>
+          <w:u w:val="none"/>
+        </w:rPr>
         <w:t>Keep the setup simple</w:t>
       </w:r>
     </w:p>
@@ -1071,16 +1142,18 @@
         <w:pStyle w:val="Heading1"/>
       </w:pPr>
       <w:r>
+        <w:rPr>
+          <w:color w:val="000000"/>
+          <w:u w:val="none"/>
+        </w:rPr>
         <w:t>Optional reference: editing later</w:t>
       </w:r>
     </w:p>
     <w:p>
       <w:r>
-        <w:t>The first-run checklist deliberately avoids every edit screen.</w:t>
+        <w:t>The first-run checklist deliberately avoids every edit screen. Supported edit workflows allow corrections; structural operations have separate restrictions.</w:t>
       </w:r>
-      <w:r>
-        <w:t xml:space="preserve"> Everything can be edited for correction.</w:t>
-      </w:r>
+      <w:r/>
     </w:p>
     <w:p>
       <w:r>
@@ -1138,6 +1211,10 @@
         <w:pStyle w:val="Heading1"/>
       </w:pPr>
       <w:r>
+        <w:rPr>
+          <w:color w:val="000000"/>
+          <w:u w:val="none"/>
+        </w:rPr>
         <w:t>Setup complete</w:t>
       </w:r>
     </w:p>
@@ -1159,7 +1236,7 @@
         <w:pStyle w:val="ListBullet"/>
       </w:pPr>
       <w:r>
-        <w:t>at least one species / hybrid</w:t>
+        <w:t>a species / hybrid, or the genus’s default unidentified entry</w:t>
       </w:r>
     </w:p>
     <w:p>
@@ -1188,7 +1265,7 @@
         <w:rPr>
           <w:b/>
         </w:rPr>
-        <w:t>03 - Add and Manage Plants in OrchidApp</w:t>
+        <w:t>02 - Add and Manage Plants in OrchidApp for Raspberry Pi / Linux</w:t>
       </w:r>
     </w:p>
     <w:sectPr>
@@ -1974,7 +2051,7 @@
       <w:rFonts w:asciiTheme="majorHAnsi" w:eastAsiaTheme="majorEastAsia" w:hAnsiTheme="majorHAnsi" w:cstheme="majorBidi"/>
       <w:b/>
       <w:bCs/>
-      <w:color w:val="1F4E79"/>
+      <w:color w:val="000000"/>
       <w:sz w:val="32"/>
       <w:szCs w:val="28"/>
     </w:rPr>
@@ -1998,7 +2075,7 @@
       <w:rFonts w:asciiTheme="majorHAnsi" w:eastAsiaTheme="majorEastAsia" w:hAnsiTheme="majorHAnsi" w:cstheme="majorBidi"/>
       <w:b/>
       <w:bCs/>
-      <w:color w:val="1F4E79"/>
+      <w:color w:val="000000"/>
       <w:sz w:val="26"/>
       <w:szCs w:val="26"/>
     </w:rPr>
@@ -2022,7 +2099,7 @@
       <w:rFonts w:asciiTheme="majorHAnsi" w:eastAsiaTheme="majorEastAsia" w:hAnsiTheme="majorHAnsi" w:cstheme="majorBidi"/>
       <w:b/>
       <w:bCs/>
-      <w:color w:val="1F4E79"/>
+      <w:color w:val="000000"/>
       <w:sz w:val="23"/>
     </w:rPr>
   </w:style>
@@ -2048,7 +2125,7 @@
       <w:bCs/>
       <w:i/>
       <w:iCs/>
-      <w:color w:val="4F81BD" w:themeColor="accent1"/>
+      <w:color w:val="000000"/>
     </w:rPr>
   </w:style>
   <w:style w:type="paragraph" w:styleId="Heading5">
@@ -2069,7 +2146,7 @@
     </w:pPr>
     <w:rPr>
       <w:rFonts w:asciiTheme="majorHAnsi" w:eastAsiaTheme="majorEastAsia" w:hAnsiTheme="majorHAnsi" w:cstheme="majorBidi"/>
-      <w:color w:val="243F60" w:themeColor="accent1" w:themeShade="7F"/>
+      <w:color w:val="000000"/>
     </w:rPr>
   </w:style>
   <w:style w:type="paragraph" w:styleId="Heading6">
@@ -2092,7 +2169,7 @@
       <w:rFonts w:asciiTheme="majorHAnsi" w:eastAsiaTheme="majorEastAsia" w:hAnsiTheme="majorHAnsi" w:cstheme="majorBidi"/>
       <w:i/>
       <w:iCs/>
-      <w:color w:val="243F60" w:themeColor="accent1" w:themeShade="7F"/>
+      <w:color w:val="000000"/>
     </w:rPr>
   </w:style>
   <w:style w:type="paragraph" w:styleId="Heading7">
@@ -2115,7 +2192,7 @@
       <w:rFonts w:asciiTheme="majorHAnsi" w:eastAsiaTheme="majorEastAsia" w:hAnsiTheme="majorHAnsi" w:cstheme="majorBidi"/>
       <w:i/>
       <w:iCs/>
-      <w:color w:val="404040" w:themeColor="text1" w:themeTint="BF"/>
+      <w:color w:val="000000"/>
     </w:rPr>
   </w:style>
   <w:style w:type="paragraph" w:styleId="Heading8">
@@ -2136,7 +2213,7 @@
     </w:pPr>
     <w:rPr>
       <w:rFonts w:asciiTheme="majorHAnsi" w:eastAsiaTheme="majorEastAsia" w:hAnsiTheme="majorHAnsi" w:cstheme="majorBidi"/>
-      <w:color w:val="4F81BD" w:themeColor="accent1"/>
+      <w:color w:val="000000"/>
       <w:sz w:val="20"/>
       <w:szCs w:val="20"/>
     </w:rPr>
@@ -2161,7 +2238,7 @@
       <w:rFonts w:asciiTheme="majorHAnsi" w:eastAsiaTheme="majorEastAsia" w:hAnsiTheme="majorHAnsi" w:cstheme="majorBidi"/>
       <w:i/>
       <w:iCs/>
-      <w:color w:val="404040" w:themeColor="text1" w:themeTint="BF"/>
+      <w:color w:val="000000"/>
       <w:sz w:val="20"/>
       <w:szCs w:val="20"/>
     </w:rPr>
@@ -2256,7 +2333,7 @@
       <w:rFonts w:asciiTheme="majorHAnsi" w:eastAsiaTheme="majorEastAsia" w:hAnsiTheme="majorHAnsi" w:cstheme="majorBidi"/>
       <w:b/>
       <w:bCs/>
-      <w:color w:val="365F91" w:themeColor="accent1" w:themeShade="BF"/>
+      <w:color w:val="000000"/>
       <w:sz w:val="28"/>
       <w:szCs w:val="28"/>
     </w:rPr>
@@ -2271,7 +2348,7 @@
       <w:rFonts w:asciiTheme="majorHAnsi" w:eastAsiaTheme="majorEastAsia" w:hAnsiTheme="majorHAnsi" w:cstheme="majorBidi"/>
       <w:b/>
       <w:bCs/>
-      <w:color w:val="4F81BD" w:themeColor="accent1"/>
+      <w:color w:val="000000"/>
       <w:sz w:val="26"/>
       <w:szCs w:val="26"/>
     </w:rPr>
@@ -2286,7 +2363,7 @@
       <w:rFonts w:asciiTheme="majorHAnsi" w:eastAsiaTheme="majorEastAsia" w:hAnsiTheme="majorHAnsi" w:cstheme="majorBidi"/>
       <w:b/>
       <w:bCs/>
-      <w:color w:val="4F81BD" w:themeColor="accent1"/>
+      <w:color w:val="000000"/>
     </w:rPr>
   </w:style>
   <w:style w:type="paragraph" w:styleId="Title">
@@ -2298,15 +2375,12 @@
     <w:qFormat/>
     <w:rsid w:val="00FC693F"/>
     <w:pPr>
-      <w:pBdr>
-        <w:bottom w:val="single" w:sz="8" w:space="4" w:color="4F81BD" w:themeColor="accent1"/>
-      </w:pBdr>
       <w:spacing w:after="300" w:line="240" w:lineRule="auto"/>
       <w:contextualSpacing/>
     </w:pPr>
     <w:rPr>
       <w:rFonts w:asciiTheme="majorHAnsi" w:eastAsiaTheme="majorEastAsia" w:hAnsiTheme="majorHAnsi" w:cstheme="majorBidi"/>
-      <w:color w:val="17365D" w:themeColor="text2" w:themeShade="BF"/>
+      <w:color w:val="000000"/>
       <w:spacing w:val="5"/>
       <w:kern w:val="28"/>
       <w:sz w:val="52"/>
@@ -2345,7 +2419,7 @@
       <w:rFonts w:asciiTheme="majorHAnsi" w:eastAsiaTheme="majorEastAsia" w:hAnsiTheme="majorHAnsi" w:cstheme="majorBidi"/>
       <w:i/>
       <w:iCs/>
-      <w:color w:val="4F81BD" w:themeColor="accent1"/>
+      <w:color w:val="000000"/>
       <w:spacing w:val="15"/>
       <w:sz w:val="24"/>
       <w:szCs w:val="24"/>
@@ -2652,7 +2726,7 @@
       <w:bCs/>
       <w:i/>
       <w:iCs/>
-      <w:color w:val="4F81BD" w:themeColor="accent1"/>
+      <w:color w:val="000000"/>
     </w:rPr>
   </w:style>
   <w:style w:type="character" w:customStyle="1" w:styleId="Heading5Char">
@@ -2664,7 +2738,7 @@
     <w:rsid w:val="00FC693F"/>
     <w:rPr>
       <w:rFonts w:asciiTheme="majorHAnsi" w:eastAsiaTheme="majorEastAsia" w:hAnsiTheme="majorHAnsi" w:cstheme="majorBidi"/>
-      <w:color w:val="243F60" w:themeColor="accent1" w:themeShade="7F"/>
+      <w:color w:val="000000"/>
     </w:rPr>
   </w:style>
   <w:style w:type="character" w:customStyle="1" w:styleId="Heading6Char">
@@ -2678,7 +2752,7 @@
       <w:rFonts w:asciiTheme="majorHAnsi" w:eastAsiaTheme="majorEastAsia" w:hAnsiTheme="majorHAnsi" w:cstheme="majorBidi"/>
       <w:i/>
       <w:iCs/>
-      <w:color w:val="243F60" w:themeColor="accent1" w:themeShade="7F"/>
+      <w:color w:val="000000"/>
     </w:rPr>
   </w:style>
   <w:style w:type="character" w:customStyle="1" w:styleId="Heading7Char">
@@ -2692,7 +2766,7 @@
       <w:rFonts w:asciiTheme="majorHAnsi" w:eastAsiaTheme="majorEastAsia" w:hAnsiTheme="majorHAnsi" w:cstheme="majorBidi"/>
       <w:i/>
       <w:iCs/>
-      <w:color w:val="404040" w:themeColor="text1" w:themeTint="BF"/>
+      <w:color w:val="000000"/>
     </w:rPr>
   </w:style>
   <w:style w:type="character" w:customStyle="1" w:styleId="Heading8Char">
@@ -2704,7 +2778,7 @@
     <w:rsid w:val="00FC693F"/>
     <w:rPr>
       <w:rFonts w:asciiTheme="majorHAnsi" w:eastAsiaTheme="majorEastAsia" w:hAnsiTheme="majorHAnsi" w:cstheme="majorBidi"/>
-      <w:color w:val="4F81BD" w:themeColor="accent1"/>
+      <w:color w:val="000000"/>
       <w:sz w:val="20"/>
       <w:szCs w:val="20"/>
     </w:rPr>
@@ -2720,7 +2794,7 @@
       <w:rFonts w:asciiTheme="majorHAnsi" w:eastAsiaTheme="majorEastAsia" w:hAnsiTheme="majorHAnsi" w:cstheme="majorBidi"/>
       <w:i/>
       <w:iCs/>
-      <w:color w:val="404040" w:themeColor="text1" w:themeTint="BF"/>
+      <w:color w:val="000000"/>
       <w:sz w:val="20"/>
       <w:szCs w:val="20"/>
     </w:rPr>

</xml_diff>

<commit_message>
Clarify and reorganize project documentation (#340)
Add developer setup, database creation, ownership and maintenance guides; move superseded material into documentation history; and revise platform, recovery and browser-client guidance. Document schema-only creation and monitoring-isolation requirements alongside the open implementation backlog. No application behavior changed.
</commit_message>
<xml_diff>
--- a/docs/user-guides/linux/01-PrepareOrchidAppForFirstUseLinuxPi.docx
+++ b/docs/user-guides/linux/01-PrepareOrchidAppForFirstUseLinuxPi.docx
@@ -9,7 +9,7 @@
       <w:r>
         <w:rPr>
           <w:b/>
-          <w:color w:val="1F4E79"/>
+          <w:color w:val="000000"/>
           <w:sz w:val="36"/>
         </w:rPr>
         <w:t>OrchidApp</w:t>
@@ -22,7 +22,7 @@
       <w:r>
         <w:rPr>
           <w:b/>
-          <w:color w:val="1F4E79"/>
+          <w:color w:val="000000"/>
           <w:sz w:val="48"/>
         </w:rPr>
         <w:t>Prepare OrchidApp for First Use</w:t>
@@ -34,6 +34,9 @@
         <w:jc w:val="center"/>
       </w:pPr>
       <w:r>
+        <w:rPr>
+          <w:color w:val="000000"/>
+        </w:rPr>
         <w:t>First-run setup checklist for Raspberry Pi / Linux</w:t>
       </w:r>
     </w:p>
@@ -42,6 +45,9 @@
         <w:jc w:val="center"/>
       </w:pPr>
       <w:r>
+        <w:rPr>
+          <w:color w:val="000000"/>
+        </w:rPr>
         <w:t>Applies to: Raspberry Pi / Linux</w:t>
       </w:r>
     </w:p>
@@ -51,7 +57,7 @@
       </w:pPr>
       <w:r>
         <w:rPr>
-          <w:color w:val="595959"/>
+          <w:color w:val="000000"/>
         </w:rPr>
         <w:t>User guide</w:t>
       </w:r>
@@ -72,6 +78,10 @@
         <w:pStyle w:val="Heading2"/>
       </w:pPr>
       <w:r>
+        <w:rPr>
+          <w:color w:val="000000"/>
+          <w:u w:val="none"/>
+        </w:rPr>
         <w:t>Before you start</w:t>
       </w:r>
     </w:p>
@@ -90,6 +100,10 @@
         <w:pStyle w:val="Heading2"/>
       </w:pPr>
       <w:r>
+        <w:rPr>
+          <w:color w:val="000000"/>
+          <w:u w:val="none"/>
+        </w:rPr>
         <w:t>Quick checklist</w:t>
       </w:r>
     </w:p>
@@ -122,7 +136,7 @@
         <w:pStyle w:val="ListBullet"/>
       </w:pPr>
       <w:r>
-        <w:t>Add at least one species / hybrid under that genus.</w:t>
+        <w:t>Add a species / hybrid, or the genus’s default unidentified entry under that genus.</w:t>
       </w:r>
     </w:p>
     <w:p>
@@ -146,6 +160,10 @@
         <w:pStyle w:val="Heading1"/>
       </w:pPr>
       <w:r>
+        <w:rPr>
+          <w:color w:val="000000"/>
+          <w:u w:val="none"/>
+        </w:rPr>
         <w:t>Step-by-step setup</w:t>
       </w:r>
     </w:p>
@@ -154,6 +172,10 @@
         <w:pStyle w:val="Heading1"/>
       </w:pPr>
       <w:r>
+        <w:rPr>
+          <w:color w:val="000000"/>
+          <w:u w:val="none"/>
+        </w:rPr>
         <w:t>1. Start OrchidApp</w:t>
       </w:r>
     </w:p>
@@ -169,7 +191,7 @@
     </w:p>
     <w:p>
       <w:r>
-        <w:t>On first use, OrchidApp may need to prepare the local database and supporting files. This may take a few minutes.</w:t>
+        <w:t>The operator must complete schema-only database creation and installation checks before this guide. Opening the Linux site does not initialise its database.</w:t>
       </w:r>
     </w:p>
     <w:p>
@@ -182,6 +204,10 @@
         <w:pStyle w:val="Heading2"/>
       </w:pPr>
       <w:r>
+        <w:rPr>
+          <w:color w:val="000000"/>
+          <w:u w:val="none"/>
+        </w:rPr>
         <w:t>First-use performance note</w:t>
       </w:r>
     </w:p>
@@ -200,6 +226,10 @@
         <w:pStyle w:val="Heading1"/>
       </w:pPr>
       <w:r>
+        <w:rPr>
+          <w:color w:val="000000"/>
+          <w:u w:val="none"/>
+        </w:rPr>
         <w:t>2. Open Setup</w:t>
       </w:r>
     </w:p>
@@ -273,6 +303,10 @@
         <w:pStyle w:val="Heading1"/>
       </w:pPr>
       <w:r>
+        <w:rPr>
+          <w:color w:val="000000"/>
+          <w:u w:val="none"/>
+        </w:rPr>
         <w:t>3. Choose what to set up first</w:t>
       </w:r>
     </w:p>
@@ -378,6 +412,10 @@
         <w:pStyle w:val="Heading1"/>
       </w:pPr>
       <w:r>
+        <w:rPr>
+          <w:color w:val="000000"/>
+          <w:u w:val="none"/>
+        </w:rPr>
         <w:t>4. Add a plant group</w:t>
       </w:r>
     </w:p>
@@ -488,14 +526,26 @@
         <w:pStyle w:val="Heading1"/>
       </w:pPr>
       <w:r>
+        <w:rPr>
+          <w:color w:val="000000"/>
+          <w:u w:val="none"/>
+        </w:rPr>
         <w:t xml:space="preserve">5. Enter </w:t>
       </w:r>
       <w:proofErr w:type="gramStart"/>
       <w:r>
+        <w:rPr>
+          <w:color w:val="000000"/>
+          <w:u w:val="none"/>
+        </w:rPr>
         <w:t>the genus</w:t>
       </w:r>
       <w:proofErr w:type="gramEnd"/>
       <w:r>
+        <w:rPr>
+          <w:color w:val="000000"/>
+          <w:u w:val="none"/>
+        </w:rPr>
         <w:t xml:space="preserve"> details</w:t>
       </w:r>
     </w:p>
@@ -582,31 +632,28 @@
         <w:pStyle w:val="Heading1"/>
       </w:pPr>
       <w:r>
+        <w:rPr>
+          <w:color w:val="000000"/>
+          <w:u w:val="none"/>
+        </w:rPr>
         <w:t>6. Check the genus has been added</w:t>
       </w:r>
     </w:p>
     <w:p>
       <w:r>
-        <w:t xml:space="preserve">After saving, the </w:t>
+        <w:t>After saving, the genus Details page opens. Select Back to return to the list.</w:t>
       </w:r>
       <w:proofErr w:type="gramStart"/>
-      <w:r>
-        <w:t>genus</w:t>
-      </w:r>
+      <w:r/>
       <w:proofErr w:type="gramEnd"/>
-      <w:r>
-        <w:t xml:space="preserve"> is confirmed and select </w:t>
-      </w:r>
+      <w:r/>
       <w:r>
         <w:rPr>
           <w:b/>
           <w:bCs/>
         </w:rPr>
-        <w:t>Back</w:t>
       </w:r>
-      <w:r>
-        <w:t xml:space="preserve"> to return to the list.</w:t>
-      </w:r>
+      <w:r/>
     </w:p>
     <w:p>
       <w:pPr>
@@ -714,6 +761,10 @@
         <w:pStyle w:val="Heading1"/>
       </w:pPr>
       <w:r>
+        <w:rPr>
+          <w:color w:val="000000"/>
+          <w:u w:val="none"/>
+        </w:rPr>
         <w:t>7. Open Species / Hybrids</w:t>
       </w:r>
     </w:p>
@@ -791,6 +842,10 @@
         <w:pStyle w:val="Heading1"/>
       </w:pPr>
       <w:r>
+        <w:rPr>
+          <w:color w:val="000000"/>
+          <w:u w:val="none"/>
+        </w:rPr>
         <w:t>8. Add a species or hybrid</w:t>
       </w:r>
     </w:p>
@@ -874,6 +929,10 @@
         <w:pStyle w:val="Heading1"/>
       </w:pPr>
       <w:r>
+        <w:rPr>
+          <w:color w:val="000000"/>
+          <w:u w:val="none"/>
+        </w:rPr>
         <w:t>9. Save the species / hybrid</w:t>
       </w:r>
     </w:p>
@@ -955,6 +1014,10 @@
         <w:pStyle w:val="Heading1"/>
       </w:pPr>
       <w:r>
+        <w:rPr>
+          <w:color w:val="000000"/>
+          <w:u w:val="none"/>
+        </w:rPr>
         <w:t>10. Confirm the species / hybrid</w:t>
       </w:r>
     </w:p>
@@ -1019,6 +1082,10 @@
         <w:pStyle w:val="Heading1"/>
       </w:pPr>
       <w:r>
+        <w:rPr>
+          <w:color w:val="000000"/>
+          <w:u w:val="none"/>
+        </w:rPr>
         <w:t>What to do next</w:t>
       </w:r>
     </w:p>
@@ -1053,6 +1120,10 @@
         <w:pStyle w:val="Heading1"/>
       </w:pPr>
       <w:r>
+        <w:rPr>
+          <w:color w:val="000000"/>
+          <w:u w:val="none"/>
+        </w:rPr>
         <w:t>Keep the setup simple</w:t>
       </w:r>
     </w:p>
@@ -1071,16 +1142,18 @@
         <w:pStyle w:val="Heading1"/>
       </w:pPr>
       <w:r>
+        <w:rPr>
+          <w:color w:val="000000"/>
+          <w:u w:val="none"/>
+        </w:rPr>
         <w:t>Optional reference: editing later</w:t>
       </w:r>
     </w:p>
     <w:p>
       <w:r>
-        <w:t>The first-run checklist deliberately avoids every edit screen.</w:t>
+        <w:t>The first-run checklist deliberately avoids every edit screen. Supported edit workflows allow corrections; structural operations have separate restrictions.</w:t>
       </w:r>
-      <w:r>
-        <w:t xml:space="preserve"> Everything can be edited for correction.</w:t>
-      </w:r>
+      <w:r/>
     </w:p>
     <w:p>
       <w:r>
@@ -1138,6 +1211,10 @@
         <w:pStyle w:val="Heading1"/>
       </w:pPr>
       <w:r>
+        <w:rPr>
+          <w:color w:val="000000"/>
+          <w:u w:val="none"/>
+        </w:rPr>
         <w:t>Setup complete</w:t>
       </w:r>
     </w:p>
@@ -1159,7 +1236,7 @@
         <w:pStyle w:val="ListBullet"/>
       </w:pPr>
       <w:r>
-        <w:t>at least one species / hybrid</w:t>
+        <w:t>a species / hybrid, or the genus’s default unidentified entry</w:t>
       </w:r>
     </w:p>
     <w:p>
@@ -1188,7 +1265,7 @@
         <w:rPr>
           <w:b/>
         </w:rPr>
-        <w:t>03 - Add and Manage Plants in OrchidApp</w:t>
+        <w:t>02 - Add and Manage Plants in OrchidApp for Raspberry Pi / Linux</w:t>
       </w:r>
     </w:p>
     <w:sectPr>
@@ -1974,7 +2051,7 @@
       <w:rFonts w:asciiTheme="majorHAnsi" w:eastAsiaTheme="majorEastAsia" w:hAnsiTheme="majorHAnsi" w:cstheme="majorBidi"/>
       <w:b/>
       <w:bCs/>
-      <w:color w:val="1F4E79"/>
+      <w:color w:val="000000"/>
       <w:sz w:val="32"/>
       <w:szCs w:val="28"/>
     </w:rPr>
@@ -1998,7 +2075,7 @@
       <w:rFonts w:asciiTheme="majorHAnsi" w:eastAsiaTheme="majorEastAsia" w:hAnsiTheme="majorHAnsi" w:cstheme="majorBidi"/>
       <w:b/>
       <w:bCs/>
-      <w:color w:val="1F4E79"/>
+      <w:color w:val="000000"/>
       <w:sz w:val="26"/>
       <w:szCs w:val="26"/>
     </w:rPr>
@@ -2022,7 +2099,7 @@
       <w:rFonts w:asciiTheme="majorHAnsi" w:eastAsiaTheme="majorEastAsia" w:hAnsiTheme="majorHAnsi" w:cstheme="majorBidi"/>
       <w:b/>
       <w:bCs/>
-      <w:color w:val="1F4E79"/>
+      <w:color w:val="000000"/>
       <w:sz w:val="23"/>
     </w:rPr>
   </w:style>
@@ -2048,7 +2125,7 @@
       <w:bCs/>
       <w:i/>
       <w:iCs/>
-      <w:color w:val="4F81BD" w:themeColor="accent1"/>
+      <w:color w:val="000000"/>
     </w:rPr>
   </w:style>
   <w:style w:type="paragraph" w:styleId="Heading5">
@@ -2069,7 +2146,7 @@
     </w:pPr>
     <w:rPr>
       <w:rFonts w:asciiTheme="majorHAnsi" w:eastAsiaTheme="majorEastAsia" w:hAnsiTheme="majorHAnsi" w:cstheme="majorBidi"/>
-      <w:color w:val="243F60" w:themeColor="accent1" w:themeShade="7F"/>
+      <w:color w:val="000000"/>
     </w:rPr>
   </w:style>
   <w:style w:type="paragraph" w:styleId="Heading6">
@@ -2092,7 +2169,7 @@
       <w:rFonts w:asciiTheme="majorHAnsi" w:eastAsiaTheme="majorEastAsia" w:hAnsiTheme="majorHAnsi" w:cstheme="majorBidi"/>
       <w:i/>
       <w:iCs/>
-      <w:color w:val="243F60" w:themeColor="accent1" w:themeShade="7F"/>
+      <w:color w:val="000000"/>
     </w:rPr>
   </w:style>
   <w:style w:type="paragraph" w:styleId="Heading7">
@@ -2115,7 +2192,7 @@
       <w:rFonts w:asciiTheme="majorHAnsi" w:eastAsiaTheme="majorEastAsia" w:hAnsiTheme="majorHAnsi" w:cstheme="majorBidi"/>
       <w:i/>
       <w:iCs/>
-      <w:color w:val="404040" w:themeColor="text1" w:themeTint="BF"/>
+      <w:color w:val="000000"/>
     </w:rPr>
   </w:style>
   <w:style w:type="paragraph" w:styleId="Heading8">
@@ -2136,7 +2213,7 @@
     </w:pPr>
     <w:rPr>
       <w:rFonts w:asciiTheme="majorHAnsi" w:eastAsiaTheme="majorEastAsia" w:hAnsiTheme="majorHAnsi" w:cstheme="majorBidi"/>
-      <w:color w:val="4F81BD" w:themeColor="accent1"/>
+      <w:color w:val="000000"/>
       <w:sz w:val="20"/>
       <w:szCs w:val="20"/>
     </w:rPr>
@@ -2161,7 +2238,7 @@
       <w:rFonts w:asciiTheme="majorHAnsi" w:eastAsiaTheme="majorEastAsia" w:hAnsiTheme="majorHAnsi" w:cstheme="majorBidi"/>
       <w:i/>
       <w:iCs/>
-      <w:color w:val="404040" w:themeColor="text1" w:themeTint="BF"/>
+      <w:color w:val="000000"/>
       <w:sz w:val="20"/>
       <w:szCs w:val="20"/>
     </w:rPr>
@@ -2256,7 +2333,7 @@
       <w:rFonts w:asciiTheme="majorHAnsi" w:eastAsiaTheme="majorEastAsia" w:hAnsiTheme="majorHAnsi" w:cstheme="majorBidi"/>
       <w:b/>
       <w:bCs/>
-      <w:color w:val="365F91" w:themeColor="accent1" w:themeShade="BF"/>
+      <w:color w:val="000000"/>
       <w:sz w:val="28"/>
       <w:szCs w:val="28"/>
     </w:rPr>
@@ -2271,7 +2348,7 @@
       <w:rFonts w:asciiTheme="majorHAnsi" w:eastAsiaTheme="majorEastAsia" w:hAnsiTheme="majorHAnsi" w:cstheme="majorBidi"/>
       <w:b/>
       <w:bCs/>
-      <w:color w:val="4F81BD" w:themeColor="accent1"/>
+      <w:color w:val="000000"/>
       <w:sz w:val="26"/>
       <w:szCs w:val="26"/>
     </w:rPr>
@@ -2286,7 +2363,7 @@
       <w:rFonts w:asciiTheme="majorHAnsi" w:eastAsiaTheme="majorEastAsia" w:hAnsiTheme="majorHAnsi" w:cstheme="majorBidi"/>
       <w:b/>
       <w:bCs/>
-      <w:color w:val="4F81BD" w:themeColor="accent1"/>
+      <w:color w:val="000000"/>
     </w:rPr>
   </w:style>
   <w:style w:type="paragraph" w:styleId="Title">
@@ -2298,15 +2375,12 @@
     <w:qFormat/>
     <w:rsid w:val="00FC693F"/>
     <w:pPr>
-      <w:pBdr>
-        <w:bottom w:val="single" w:sz="8" w:space="4" w:color="4F81BD" w:themeColor="accent1"/>
-      </w:pBdr>
       <w:spacing w:after="300" w:line="240" w:lineRule="auto"/>
       <w:contextualSpacing/>
     </w:pPr>
     <w:rPr>
       <w:rFonts w:asciiTheme="majorHAnsi" w:eastAsiaTheme="majorEastAsia" w:hAnsiTheme="majorHAnsi" w:cstheme="majorBidi"/>
-      <w:color w:val="17365D" w:themeColor="text2" w:themeShade="BF"/>
+      <w:color w:val="000000"/>
       <w:spacing w:val="5"/>
       <w:kern w:val="28"/>
       <w:sz w:val="52"/>
@@ -2345,7 +2419,7 @@
       <w:rFonts w:asciiTheme="majorHAnsi" w:eastAsiaTheme="majorEastAsia" w:hAnsiTheme="majorHAnsi" w:cstheme="majorBidi"/>
       <w:i/>
       <w:iCs/>
-      <w:color w:val="4F81BD" w:themeColor="accent1"/>
+      <w:color w:val="000000"/>
       <w:spacing w:val="15"/>
       <w:sz w:val="24"/>
       <w:szCs w:val="24"/>
@@ -2652,7 +2726,7 @@
       <w:bCs/>
       <w:i/>
       <w:iCs/>
-      <w:color w:val="4F81BD" w:themeColor="accent1"/>
+      <w:color w:val="000000"/>
     </w:rPr>
   </w:style>
   <w:style w:type="character" w:customStyle="1" w:styleId="Heading5Char">
@@ -2664,7 +2738,7 @@
     <w:rsid w:val="00FC693F"/>
     <w:rPr>
       <w:rFonts w:asciiTheme="majorHAnsi" w:eastAsiaTheme="majorEastAsia" w:hAnsiTheme="majorHAnsi" w:cstheme="majorBidi"/>
-      <w:color w:val="243F60" w:themeColor="accent1" w:themeShade="7F"/>
+      <w:color w:val="000000"/>
     </w:rPr>
   </w:style>
   <w:style w:type="character" w:customStyle="1" w:styleId="Heading6Char">
@@ -2678,7 +2752,7 @@
       <w:rFonts w:asciiTheme="majorHAnsi" w:eastAsiaTheme="majorEastAsia" w:hAnsiTheme="majorHAnsi" w:cstheme="majorBidi"/>
       <w:i/>
       <w:iCs/>
-      <w:color w:val="243F60" w:themeColor="accent1" w:themeShade="7F"/>
+      <w:color w:val="000000"/>
     </w:rPr>
   </w:style>
   <w:style w:type="character" w:customStyle="1" w:styleId="Heading7Char">
@@ -2692,7 +2766,7 @@
       <w:rFonts w:asciiTheme="majorHAnsi" w:eastAsiaTheme="majorEastAsia" w:hAnsiTheme="majorHAnsi" w:cstheme="majorBidi"/>
       <w:i/>
       <w:iCs/>
-      <w:color w:val="404040" w:themeColor="text1" w:themeTint="BF"/>
+      <w:color w:val="000000"/>
     </w:rPr>
   </w:style>
   <w:style w:type="character" w:customStyle="1" w:styleId="Heading8Char">
@@ -2704,7 +2778,7 @@
     <w:rsid w:val="00FC693F"/>
     <w:rPr>
       <w:rFonts w:asciiTheme="majorHAnsi" w:eastAsiaTheme="majorEastAsia" w:hAnsiTheme="majorHAnsi" w:cstheme="majorBidi"/>
-      <w:color w:val="4F81BD" w:themeColor="accent1"/>
+      <w:color w:val="000000"/>
       <w:sz w:val="20"/>
       <w:szCs w:val="20"/>
     </w:rPr>
@@ -2720,7 +2794,7 @@
       <w:rFonts w:asciiTheme="majorHAnsi" w:eastAsiaTheme="majorEastAsia" w:hAnsiTheme="majorHAnsi" w:cstheme="majorBidi"/>
       <w:i/>
       <w:iCs/>
-      <w:color w:val="404040" w:themeColor="text1" w:themeTint="BF"/>
+      <w:color w:val="000000"/>
       <w:sz w:val="20"/>
       <w:szCs w:val="20"/>
     </w:rPr>

</xml_diff>